<commit_message>
Update Lab 2 report template for clarity and consistency in formatting
</commit_message>
<xml_diff>
--- a/lab02_webots_ur5e_frames/Lab02_Report_Template.docx
+++ b/lab02_webots_ur5e_frames/Lab02_Report_Template.docx
@@ -8,12 +8,12 @@
       </w:pPr>
       <w:r>
         <w:rPr>
-          <w:rFonts w:ascii="Calibri" w:hAnsi="Calibri"/>
-          <w:b/>
-          <w:color w:val="2E74B5"/>
-          <w:sz w:val="19"/>
+          <w:rFonts w:ascii="Arial" w:hAnsi="Arial"/>
+          <w:b w:val="0"/>
+          <w:color w:val="000000"/>
+          <w:sz w:val="20"/>
         </w:rPr>
-        <w:t>EEL 4664 - KINEMATICS AND CONTROL OF ROBOTIC SYSTEMS</w:t>
+        <w:t>EEL 4664</w:t>
       </w:r>
     </w:p>
     <w:p>
@@ -22,10 +22,10 @@
       </w:pPr>
       <w:r>
         <w:rPr>
-          <w:rFonts w:ascii="Calibri" w:hAnsi="Calibri"/>
-          <w:b/>
-          <w:color w:val="0B2545"/>
-          <w:sz w:val="52"/>
+          <w:rFonts w:ascii="Arial" w:hAnsi="Arial"/>
+          <w:b w:val="0"/>
+          <w:color w:val="000000"/>
+          <w:sz w:val="44"/>
         </w:rPr>
         <w:t>Lab 2 Report</w:t>
       </w:r>
@@ -36,9 +36,10 @@
       </w:pPr>
       <w:r>
         <w:rPr>
-          <w:rFonts w:ascii="Calibri" w:hAnsi="Calibri"/>
-          <w:color w:val="1F4D78"/>
-          <w:sz w:val="28"/>
+          <w:rFonts w:ascii="Arial" w:hAnsi="Arial"/>
+          <w:b w:val="0"/>
+          <w:color w:val="000000"/>
+          <w:sz w:val="24"/>
         </w:rPr>
         <w:t>UR5e Frames and Forward Kinematics</w:t>
       </w:r>
@@ -50,12 +51,12 @@
         <w:tblLook w:firstColumn="1" w:firstRow="1" w:lastColumn="0" w:lastRow="0" w:noHBand="0" w:noVBand="1" w:val="04A0"/>
         <w:tblInd w:w="120" w:type="dxa"/>
         <w:tblBorders>
-          <w:top w:val="single" w:sz="6" w:color="B7C5D5"/>
-          <w:left w:val="single" w:sz="6" w:color="B7C5D5"/>
-          <w:bottom w:val="single" w:sz="6" w:color="B7C5D5"/>
-          <w:right w:val="single" w:sz="6" w:color="B7C5D5"/>
-          <w:insideH w:val="single" w:sz="6" w:color="B7C5D5"/>
-          <w:insideV w:val="single" w:sz="6" w:color="B7C5D5"/>
+          <w:top w:val="single" w:sz="4" w:color="D9D9D9"/>
+          <w:left w:val="single" w:sz="4" w:color="D9D9D9"/>
+          <w:bottom w:val="single" w:sz="4" w:color="D9D9D9"/>
+          <w:right w:val="single" w:sz="4" w:color="D9D9D9"/>
+          <w:insideH w:val="single" w:sz="4" w:color="D9D9D9"/>
+          <w:insideV w:val="single" w:sz="4" w:color="D9D9D9"/>
         </w:tblBorders>
       </w:tblPr>
       <w:tblGrid>
@@ -72,26 +73,27 @@
               <w:bottom w:w="100" w:type="dxa"/>
               <w:end w:w="120" w:type="dxa"/>
             </w:tcMar>
-            <w:shd w:fill="E8EEF5"/>
+            <w:shd w:fill="FFFFFF"/>
             <w:vAlign w:val="center"/>
           </w:tcPr>
           <w:p>
             <w:r>
               <w:rPr>
-                <w:rFonts w:ascii="Calibri" w:hAnsi="Calibri"/>
+                <w:rFonts w:ascii="Arial" w:hAnsi="Arial"/>
                 <w:b/>
-                <w:color w:val="1F4D78"/>
-                <w:sz w:val="18"/>
+                <w:color w:val="000000"/>
+                <w:sz w:val="20"/>
               </w:rPr>
               <w:t>Student name</w:t>
               <w:br/>
             </w:r>
             <w:r>
               <w:rPr>
-                <w:rFonts w:ascii="Calibri" w:hAnsi="Calibri"/>
+                <w:rFonts w:ascii="Arial" w:hAnsi="Arial"/>
+                <w:b w:val="0"/>
                 <w:i/>
-                <w:color w:val="5F6B76"/>
-                <w:sz w:val="21"/>
+                <w:color w:val="000000"/>
+                <w:sz w:val="20"/>
               </w:rPr>
               <w:t>Click here and type your name</w:t>
             </w:r>
@@ -106,26 +108,27 @@
               <w:bottom w:w="100" w:type="dxa"/>
               <w:end w:w="120" w:type="dxa"/>
             </w:tcMar>
-            <w:shd w:fill="E8EEF5"/>
+            <w:shd w:fill="FFFFFF"/>
             <w:vAlign w:val="center"/>
           </w:tcPr>
           <w:p>
             <w:r>
               <w:rPr>
-                <w:rFonts w:ascii="Calibri" w:hAnsi="Calibri"/>
+                <w:rFonts w:ascii="Arial" w:hAnsi="Arial"/>
                 <w:b/>
-                <w:color w:val="1F4D78"/>
-                <w:sz w:val="18"/>
+                <w:color w:val="000000"/>
+                <w:sz w:val="20"/>
               </w:rPr>
               <w:t>Course section / team</w:t>
               <w:br/>
             </w:r>
             <w:r>
               <w:rPr>
-                <w:rFonts w:ascii="Calibri" w:hAnsi="Calibri"/>
+                <w:rFonts w:ascii="Arial" w:hAnsi="Arial"/>
+                <w:b w:val="0"/>
                 <w:i/>
-                <w:color w:val="5F6B76"/>
-                <w:sz w:val="21"/>
+                <w:color w:val="000000"/>
+                <w:sz w:val="20"/>
               </w:rPr>
               <w:t>Click here and type</w:t>
             </w:r>
@@ -142,26 +145,27 @@
               <w:bottom w:w="100" w:type="dxa"/>
               <w:end w:w="120" w:type="dxa"/>
             </w:tcMar>
-            <w:shd w:fill="E8EEF5"/>
+            <w:shd w:fill="FFFFFF"/>
             <w:vAlign w:val="center"/>
           </w:tcPr>
           <w:p>
             <w:r>
               <w:rPr>
-                <w:rFonts w:ascii="Calibri" w:hAnsi="Calibri"/>
+                <w:rFonts w:ascii="Arial" w:hAnsi="Arial"/>
                 <w:b/>
-                <w:color w:val="1F4D78"/>
-                <w:sz w:val="18"/>
+                <w:color w:val="000000"/>
+                <w:sz w:val="20"/>
               </w:rPr>
               <w:t>Date</w:t>
               <w:br/>
             </w:r>
             <w:r>
               <w:rPr>
-                <w:rFonts w:ascii="Calibri" w:hAnsi="Calibri"/>
+                <w:rFonts w:ascii="Arial" w:hAnsi="Arial"/>
+                <w:b w:val="0"/>
                 <w:i/>
-                <w:color w:val="5F6B76"/>
-                <w:sz w:val="21"/>
+                <w:color w:val="000000"/>
+                <w:sz w:val="20"/>
               </w:rPr>
               <w:t>Click here and type the date</w:t>
             </w:r>
@@ -176,28 +180,20 @@
               <w:bottom w:w="100" w:type="dxa"/>
               <w:end w:w="120" w:type="dxa"/>
             </w:tcMar>
-            <w:shd w:fill="E8EEF5"/>
+            <w:shd w:fill="FFFFFF"/>
             <w:vAlign w:val="center"/>
           </w:tcPr>
           <w:p>
             <w:r>
               <w:rPr>
-                <w:rFonts w:ascii="Calibri" w:hAnsi="Calibri"/>
+                <w:rFonts w:ascii="Arial" w:hAnsi="Arial"/>
                 <w:b/>
-                <w:color w:val="1F4D78"/>
-                <w:sz w:val="18"/>
+                <w:color w:val="000000"/>
+                <w:sz w:val="20"/>
               </w:rPr>
-              <w:t>Repository commit</w:t>
+              <w:t>Lab partner(s)</w:t>
               <w:br/>
-            </w:r>
-            <w:r>
-              <w:rPr>
-                <w:rFonts w:ascii="Calibri" w:hAnsi="Calibri"/>
-                <w:i/>
-                <w:color w:val="5F6B76"/>
-                <w:sz w:val="21"/>
-              </w:rPr>
-              <w:t>Optional: paste git commit ID</w:t>
+              <w:t>Type names, or leave blank</w:t>
             </w:r>
           </w:p>
         </w:tc>
@@ -210,12 +206,12 @@
         <w:tblLook w:firstColumn="1" w:firstRow="1" w:lastColumn="0" w:lastRow="0" w:noHBand="0" w:noVBand="1" w:val="04A0"/>
         <w:tblInd w:w="120" w:type="dxa"/>
         <w:tblBorders>
-          <w:top w:val="single" w:sz="6" w:color="B7C5D5"/>
-          <w:left w:val="single" w:sz="6" w:color="B7C5D5"/>
-          <w:bottom w:val="single" w:sz="6" w:color="B7C5D5"/>
-          <w:right w:val="single" w:sz="6" w:color="B7C5D5"/>
-          <w:insideH w:val="single" w:sz="6" w:color="B7C5D5"/>
-          <w:insideV w:val="single" w:sz="6" w:color="B7C5D5"/>
+          <w:top w:val="single" w:sz="4" w:color="D9D9D9"/>
+          <w:left w:val="single" w:sz="4" w:color="D9D9D9"/>
+          <w:bottom w:val="single" w:sz="4" w:color="D9D9D9"/>
+          <w:right w:val="single" w:sz="4" w:color="D9D9D9"/>
+          <w:insideH w:val="single" w:sz="4" w:color="D9D9D9"/>
+          <w:insideV w:val="single" w:sz="4" w:color="D9D9D9"/>
         </w:tblBorders>
       </w:tblPr>
       <w:tblGrid>
@@ -231,7 +227,7 @@
               <w:bottom w:w="100" w:type="dxa"/>
               <w:end w:w="120" w:type="dxa"/>
             </w:tcMar>
-            <w:shd w:fill="F4F6F9"/>
+            <w:shd w:fill="FFFFFF"/>
           </w:tcPr>
           <w:p>
             <w:pPr>
@@ -239,20 +235,10 @@
             </w:pPr>
             <w:r>
               <w:rPr>
-                <w:rFonts w:ascii="Calibri" w:hAnsi="Calibri"/>
-                <w:b/>
-                <w:color w:val="0B2545"/>
-                <w:sz w:val="21"/>
+                <w:rFonts w:ascii="Arial" w:hAnsi="Arial"/>
+                <w:color w:val="000000"/>
               </w:rPr>
-              <w:t xml:space="preserve">How to complete this report: </w:t>
-            </w:r>
-            <w:r>
-              <w:rPr>
-                <w:rFonts w:ascii="Calibri" w:hAnsi="Calibri"/>
-                <w:color w:val="0B2545"/>
-                <w:sz w:val="21"/>
-              </w:rPr>
-              <w:t>Replace gray prompt text with your results. Paste Console or terminal output as text. Use Insert &gt; Pictures to add screenshots in the marked boxes. Keep the labels and submit this Word file (.docx).</w:t>
+              <w:t>Directions: Replace the prompt text with your results. Paste output as text and add screenshots with Insert &gt; Pictures. Save and submit this .docx file.</w:t>
             </w:r>
           </w:p>
         </w:tc>
@@ -263,7 +249,11 @@
         <w:pStyle w:val="Heading1"/>
       </w:pPr>
       <w:r>
-        <w:t>1. Diagnostics</w:t>
+        <w:rPr>
+          <w:rFonts w:ascii="Arial" w:hAnsi="Arial"/>
+          <w:color w:val="000000"/>
+        </w:rPr>
+        <w:t>1. Webots diagnostics</w:t>
       </w:r>
     </w:p>
     <w:p>
@@ -272,9 +262,9 @@
       </w:pPr>
       <w:r>
         <w:rPr>
-          <w:rFonts w:ascii="Calibri" w:hAnsi="Calibri"/>
+          <w:rFonts w:ascii="Arial" w:hAnsi="Arial"/>
           <w:b/>
-          <w:color w:val="1F4D78"/>
+          <w:color w:val="000000"/>
           <w:sz w:val="21"/>
         </w:rPr>
         <w:t>Minimal-controller result</w:t>
@@ -287,12 +277,12 @@
         <w:tblLook w:firstColumn="1" w:firstRow="1" w:lastColumn="0" w:lastRow="0" w:noHBand="0" w:noVBand="1" w:val="04A0"/>
         <w:tblInd w:w="120" w:type="dxa"/>
         <w:tblBorders>
-          <w:top w:val="single" w:sz="6" w:color="B7C5D5"/>
-          <w:left w:val="single" w:sz="6" w:color="B7C5D5"/>
-          <w:bottom w:val="single" w:sz="6" w:color="B7C5D5"/>
-          <w:right w:val="single" w:sz="6" w:color="B7C5D5"/>
-          <w:insideH w:val="single" w:sz="6" w:color="B7C5D5"/>
-          <w:insideV w:val="single" w:sz="6" w:color="B7C5D5"/>
+          <w:top w:val="single" w:sz="4" w:color="D9D9D9"/>
+          <w:left w:val="single" w:sz="4" w:color="D9D9D9"/>
+          <w:bottom w:val="single" w:sz="4" w:color="D9D9D9"/>
+          <w:right w:val="single" w:sz="4" w:color="D9D9D9"/>
+          <w:insideH w:val="single" w:sz="4" w:color="D9D9D9"/>
+          <w:insideV w:val="single" w:sz="4" w:color="D9D9D9"/>
         </w:tblBorders>
       </w:tblPr>
       <w:tblGrid>
@@ -312,7 +302,7 @@
               <w:end w:w="120" w:type="dxa"/>
             </w:tcMar>
             <w:vAlign w:val="top"/>
-            <w:shd w:fill="F4F6F9"/>
+            <w:shd w:fill="FFFFFF"/>
           </w:tcPr>
           <w:p>
             <w:pPr>
@@ -322,7 +312,7 @@
               <w:rPr>
                 <w:rFonts w:ascii="Consolas" w:hAnsi="Consolas"/>
                 <w:i/>
-                <w:color w:val="5F6B76"/>
+                <w:color w:val="000000"/>
                 <w:sz w:val="19"/>
               </w:rPr>
               <w:t>Paste the diagnostic_minimal Console output here.</w:t>
@@ -337,9 +327,9 @@
       </w:pPr>
       <w:r>
         <w:rPr>
-          <w:rFonts w:ascii="Calibri" w:hAnsi="Calibri"/>
+          <w:rFonts w:ascii="Arial" w:hAnsi="Arial"/>
           <w:b/>
-          <w:color w:val="1F4D78"/>
+          <w:color w:val="000000"/>
           <w:sz w:val="21"/>
         </w:rPr>
         <w:t>Device-listing result</w:t>
@@ -352,12 +342,12 @@
         <w:tblLook w:firstColumn="1" w:firstRow="1" w:lastColumn="0" w:lastRow="0" w:noHBand="0" w:noVBand="1" w:val="04A0"/>
         <w:tblInd w:w="120" w:type="dxa"/>
         <w:tblBorders>
-          <w:top w:val="single" w:sz="6" w:color="B7C5D5"/>
-          <w:left w:val="single" w:sz="6" w:color="B7C5D5"/>
-          <w:bottom w:val="single" w:sz="6" w:color="B7C5D5"/>
-          <w:right w:val="single" w:sz="6" w:color="B7C5D5"/>
-          <w:insideH w:val="single" w:sz="6" w:color="B7C5D5"/>
-          <w:insideV w:val="single" w:sz="6" w:color="B7C5D5"/>
+          <w:top w:val="single" w:sz="4" w:color="D9D9D9"/>
+          <w:left w:val="single" w:sz="4" w:color="D9D9D9"/>
+          <w:bottom w:val="single" w:sz="4" w:color="D9D9D9"/>
+          <w:right w:val="single" w:sz="4" w:color="D9D9D9"/>
+          <w:insideH w:val="single" w:sz="4" w:color="D9D9D9"/>
+          <w:insideV w:val="single" w:sz="4" w:color="D9D9D9"/>
         </w:tblBorders>
       </w:tblPr>
       <w:tblGrid>
@@ -377,7 +367,7 @@
               <w:end w:w="120" w:type="dxa"/>
             </w:tcMar>
             <w:vAlign w:val="top"/>
-            <w:shd w:fill="F4F6F9"/>
+            <w:shd w:fill="FFFFFF"/>
           </w:tcPr>
           <w:p>
             <w:pPr>
@@ -387,7 +377,7 @@
               <w:rPr>
                 <w:rFonts w:ascii="Consolas" w:hAnsi="Consolas"/>
                 <w:i/>
-                <w:color w:val="5F6B76"/>
+                <w:color w:val="000000"/>
                 <w:sz w:val="19"/>
               </w:rPr>
               <w:t>Paste the diagnostic_devices PASS line and any missing-device message here.</w:t>
@@ -402,12 +392,10 @@
       </w:pPr>
       <w:r>
         <w:rPr>
-          <w:rFonts w:ascii="Calibri" w:hAnsi="Calibri"/>
-          <w:b/>
-          <w:color w:val="1F4D78"/>
-          <w:sz w:val="21"/>
+          <w:rFonts w:ascii="Arial" w:hAnsi="Arial"/>
+          <w:color w:val="000000"/>
         </w:rPr>
-        <w:t>Diagnostic evidence</w:t>
+        <w:t>Screenshot</w:t>
       </w:r>
     </w:p>
     <w:tbl>
@@ -417,12 +405,12 @@
         <w:tblLook w:firstColumn="1" w:firstRow="1" w:lastColumn="0" w:lastRow="0" w:noHBand="0" w:noVBand="1" w:val="04A0"/>
         <w:tblInd w:w="120" w:type="dxa"/>
         <w:tblBorders>
-          <w:top w:val="single" w:sz="6" w:color="B7C5D5"/>
-          <w:left w:val="single" w:sz="6" w:color="B7C5D5"/>
-          <w:bottom w:val="single" w:sz="6" w:color="B7C5D5"/>
-          <w:right w:val="single" w:sz="6" w:color="B7C5D5"/>
-          <w:insideH w:val="single" w:sz="6" w:color="B7C5D5"/>
-          <w:insideV w:val="single" w:sz="6" w:color="B7C5D5"/>
+          <w:top w:val="single" w:sz="4" w:color="D9D9D9"/>
+          <w:left w:val="single" w:sz="4" w:color="D9D9D9"/>
+          <w:bottom w:val="single" w:sz="4" w:color="D9D9D9"/>
+          <w:right w:val="single" w:sz="4" w:color="D9D9D9"/>
+          <w:insideH w:val="single" w:sz="4" w:color="D9D9D9"/>
+          <w:insideV w:val="single" w:sz="4" w:color="D9D9D9"/>
         </w:tblBorders>
       </w:tblPr>
       <w:tblGrid>
@@ -450,20 +438,21 @@
             </w:pPr>
             <w:r>
               <w:rPr>
-                <w:rFonts w:ascii="Calibri" w:hAnsi="Calibri"/>
+                <w:rFonts w:ascii="Arial" w:hAnsi="Arial"/>
                 <w:b/>
-                <w:color w:val="2E74B5"/>
-                <w:sz w:val="21"/>
+                <w:i/>
+                <w:color w:val="000000"/>
+                <w:sz w:val="20"/>
               </w:rPr>
               <w:t>SCREENSHOT PLACEHOLDER</w:t>
               <w:br/>
             </w:r>
             <w:r>
               <w:rPr>
-                <w:rFonts w:ascii="Calibri" w:hAnsi="Calibri"/>
+                <w:rFonts w:ascii="Arial" w:hAnsi="Arial"/>
                 <w:i/>
-                <w:color w:val="5F6B76"/>
-                <w:sz w:val="21"/>
+                <w:color w:val="000000"/>
+                <w:sz w:val="20"/>
               </w:rPr>
               <w:t>Insert one screenshot showing the Webots Console after the device diagnostic.</w:t>
             </w:r>
@@ -473,6 +462,10 @@
     </w:tbl>
     <w:p>
       <w:r>
+        <w:rPr>
+          <w:rFonts w:ascii="Arial" w:hAnsi="Arial"/>
+          <w:color w:val="000000"/>
+        </w:rPr>
         <w:br w:type="page"/>
       </w:r>
     </w:p>
@@ -481,7 +474,11 @@
         <w:pStyle w:val="Heading1"/>
       </w:pPr>
       <w:r>
-        <w:t>2. Modified-DH Entries and Offline FK Tests</w:t>
+        <w:rPr>
+          <w:rFonts w:ascii="Arial" w:hAnsi="Arial"/>
+          <w:color w:val="000000"/>
+        </w:rPr>
+        <w:t>2. Modified-DH entries and offline tests</w:t>
       </w:r>
     </w:p>
     <w:p>
@@ -490,9 +487,9 @@
       </w:pPr>
       <w:r>
         <w:rPr>
-          <w:rFonts w:ascii="Calibri" w:hAnsi="Calibri"/>
+          <w:rFonts w:ascii="Arial" w:hAnsi="Arial"/>
           <w:b/>
-          <w:color w:val="1F4D78"/>
+          <w:color w:val="000000"/>
           <w:sz w:val="21"/>
         </w:rPr>
         <w:t>Two completed matrix entries</w:t>
@@ -505,12 +502,12 @@
         <w:tblLook w:firstColumn="1" w:firstRow="1" w:lastColumn="0" w:lastRow="0" w:noHBand="0" w:noVBand="1" w:val="04A0"/>
         <w:tblInd w:w="120" w:type="dxa"/>
         <w:tblBorders>
-          <w:top w:val="single" w:sz="6" w:color="B7C5D5"/>
-          <w:left w:val="single" w:sz="6" w:color="B7C5D5"/>
-          <w:bottom w:val="single" w:sz="6" w:color="B7C5D5"/>
-          <w:right w:val="single" w:sz="6" w:color="B7C5D5"/>
-          <w:insideH w:val="single" w:sz="6" w:color="B7C5D5"/>
-          <w:insideV w:val="single" w:sz="6" w:color="B7C5D5"/>
+          <w:top w:val="single" w:sz="4" w:color="D9D9D9"/>
+          <w:left w:val="single" w:sz="4" w:color="D9D9D9"/>
+          <w:bottom w:val="single" w:sz="4" w:color="D9D9D9"/>
+          <w:right w:val="single" w:sz="4" w:color="D9D9D9"/>
+          <w:insideH w:val="single" w:sz="4" w:color="D9D9D9"/>
+          <w:insideV w:val="single" w:sz="4" w:color="D9D9D9"/>
         </w:tblBorders>
       </w:tblPr>
       <w:tblGrid>
@@ -530,7 +527,7 @@
               <w:end w:w="120" w:type="dxa"/>
             </w:tcMar>
             <w:vAlign w:val="top"/>
-            <w:shd w:fill="F4F6F9"/>
+            <w:shd w:fill="FFFFFF"/>
           </w:tcPr>
           <w:p>
             <w:pPr>
@@ -540,7 +537,7 @@
               <w:rPr>
                 <w:rFonts w:ascii="Consolas" w:hAnsi="Consolas"/>
                 <w:i/>
-                <w:color w:val="5F6B76"/>
+                <w:color w:val="000000"/>
                 <w:sz w:val="19"/>
               </w:rPr>
               <w:t>row_2_column_1 =</w:t>
@@ -557,9 +554,9 @@
       </w:pPr>
       <w:r>
         <w:rPr>
-          <w:rFonts w:ascii="Calibri" w:hAnsi="Calibri"/>
+          <w:rFonts w:ascii="Arial" w:hAnsi="Arial"/>
           <w:b/>
-          <w:color w:val="1F4D78"/>
+          <w:color w:val="000000"/>
           <w:sz w:val="21"/>
         </w:rPr>
         <w:t>Zero-configuration test</w:t>
@@ -572,12 +569,12 @@
         <w:tblLook w:firstColumn="1" w:firstRow="1" w:lastColumn="0" w:lastRow="0" w:noHBand="0" w:noVBand="1" w:val="04A0"/>
         <w:tblInd w:w="120" w:type="dxa"/>
         <w:tblBorders>
-          <w:top w:val="single" w:sz="6" w:color="B7C5D5"/>
-          <w:left w:val="single" w:sz="6" w:color="B7C5D5"/>
-          <w:bottom w:val="single" w:sz="6" w:color="B7C5D5"/>
-          <w:right w:val="single" w:sz="6" w:color="B7C5D5"/>
-          <w:insideH w:val="single" w:sz="6" w:color="B7C5D5"/>
-          <w:insideV w:val="single" w:sz="6" w:color="B7C5D5"/>
+          <w:top w:val="single" w:sz="4" w:color="D9D9D9"/>
+          <w:left w:val="single" w:sz="4" w:color="D9D9D9"/>
+          <w:bottom w:val="single" w:sz="4" w:color="D9D9D9"/>
+          <w:right w:val="single" w:sz="4" w:color="D9D9D9"/>
+          <w:insideH w:val="single" w:sz="4" w:color="D9D9D9"/>
+          <w:insideV w:val="single" w:sz="4" w:color="D9D9D9"/>
         </w:tblBorders>
       </w:tblPr>
       <w:tblGrid>
@@ -597,7 +594,7 @@
               <w:end w:w="120" w:type="dxa"/>
             </w:tcMar>
             <w:vAlign w:val="top"/>
-            <w:shd w:fill="F4F6F9"/>
+            <w:shd w:fill="FFFFFF"/>
           </w:tcPr>
           <w:p>
             <w:pPr>
@@ -607,7 +604,7 @@
               <w:rPr>
                 <w:rFonts w:ascii="Consolas" w:hAnsi="Consolas"/>
                 <w:i/>
-                <w:color w:val="5F6B76"/>
+                <w:color w:val="000000"/>
                 <w:sz w:val="19"/>
               </w:rPr>
               <w:t>Paste the 4-by-4 matrix, orthogonality error, and determinant here.</w:t>
@@ -622,9 +619,9 @@
       </w:pPr>
       <w:r>
         <w:rPr>
-          <w:rFonts w:ascii="Calibri" w:hAnsi="Calibri"/>
+          <w:rFonts w:ascii="Arial" w:hAnsi="Arial"/>
           <w:b/>
-          <w:color w:val="1F4D78"/>
+          <w:color w:val="000000"/>
           <w:sz w:val="21"/>
         </w:rPr>
         <w:t>Nonsymmetric-configuration test</w:t>
@@ -637,12 +634,12 @@
         <w:tblLook w:firstColumn="1" w:firstRow="1" w:lastColumn="0" w:lastRow="0" w:noHBand="0" w:noVBand="1" w:val="04A0"/>
         <w:tblInd w:w="120" w:type="dxa"/>
         <w:tblBorders>
-          <w:top w:val="single" w:sz="6" w:color="B7C5D5"/>
-          <w:left w:val="single" w:sz="6" w:color="B7C5D5"/>
-          <w:bottom w:val="single" w:sz="6" w:color="B7C5D5"/>
-          <w:right w:val="single" w:sz="6" w:color="B7C5D5"/>
-          <w:insideH w:val="single" w:sz="6" w:color="B7C5D5"/>
-          <w:insideV w:val="single" w:sz="6" w:color="B7C5D5"/>
+          <w:top w:val="single" w:sz="4" w:color="D9D9D9"/>
+          <w:left w:val="single" w:sz="4" w:color="D9D9D9"/>
+          <w:bottom w:val="single" w:sz="4" w:color="D9D9D9"/>
+          <w:right w:val="single" w:sz="4" w:color="D9D9D9"/>
+          <w:insideH w:val="single" w:sz="4" w:color="D9D9D9"/>
+          <w:insideV w:val="single" w:sz="4" w:color="D9D9D9"/>
         </w:tblBorders>
       </w:tblPr>
       <w:tblGrid>
@@ -662,7 +659,7 @@
               <w:end w:w="120" w:type="dxa"/>
             </w:tcMar>
             <w:vAlign w:val="top"/>
-            <w:shd w:fill="F4F6F9"/>
+            <w:shd w:fill="FFFFFF"/>
           </w:tcPr>
           <w:p>
             <w:pPr>
@@ -672,7 +669,7 @@
               <w:rPr>
                 <w:rFonts w:ascii="Consolas" w:hAnsi="Consolas"/>
                 <w:i/>
-                <w:color w:val="5F6B76"/>
+                <w:color w:val="000000"/>
                 <w:sz w:val="19"/>
               </w:rPr>
               <w:t>Paste the 4-by-4 matrix, orthogonality error, and determinant here.</w:t>
@@ -687,12 +684,10 @@
       </w:pPr>
       <w:r>
         <w:rPr>
-          <w:rFonts w:ascii="Calibri" w:hAnsi="Calibri"/>
-          <w:b/>
-          <w:color w:val="1F4D78"/>
-          <w:sz w:val="21"/>
+          <w:rFonts w:ascii="Arial" w:hAnsi="Arial"/>
+          <w:color w:val="000000"/>
         </w:rPr>
-        <w:t>Offline-test evidence</w:t>
+        <w:t>Screenshot</w:t>
       </w:r>
     </w:p>
     <w:tbl>
@@ -702,12 +697,12 @@
         <w:tblLook w:firstColumn="1" w:firstRow="1" w:lastColumn="0" w:lastRow="0" w:noHBand="0" w:noVBand="1" w:val="04A0"/>
         <w:tblInd w:w="120" w:type="dxa"/>
         <w:tblBorders>
-          <w:top w:val="single" w:sz="6" w:color="B7C5D5"/>
-          <w:left w:val="single" w:sz="6" w:color="B7C5D5"/>
-          <w:bottom w:val="single" w:sz="6" w:color="B7C5D5"/>
-          <w:right w:val="single" w:sz="6" w:color="B7C5D5"/>
-          <w:insideH w:val="single" w:sz="6" w:color="B7C5D5"/>
-          <w:insideV w:val="single" w:sz="6" w:color="B7C5D5"/>
+          <w:top w:val="single" w:sz="4" w:color="D9D9D9"/>
+          <w:left w:val="single" w:sz="4" w:color="D9D9D9"/>
+          <w:bottom w:val="single" w:sz="4" w:color="D9D9D9"/>
+          <w:right w:val="single" w:sz="4" w:color="D9D9D9"/>
+          <w:insideH w:val="single" w:sz="4" w:color="D9D9D9"/>
+          <w:insideV w:val="single" w:sz="4" w:color="D9D9D9"/>
         </w:tblBorders>
       </w:tblPr>
       <w:tblGrid>
@@ -735,20 +730,21 @@
             </w:pPr>
             <w:r>
               <w:rPr>
-                <w:rFonts w:ascii="Calibri" w:hAnsi="Calibri"/>
+                <w:rFonts w:ascii="Arial" w:hAnsi="Arial"/>
                 <w:b/>
-                <w:color w:val="2E74B5"/>
-                <w:sz w:val="21"/>
+                <w:i/>
+                <w:color w:val="000000"/>
+                <w:sz w:val="20"/>
               </w:rPr>
               <w:t>SCREENSHOT PLACEHOLDER</w:t>
               <w:br/>
             </w:r>
             <w:r>
               <w:rPr>
-                <w:rFonts w:ascii="Calibri" w:hAnsi="Calibri"/>
+                <w:rFonts w:ascii="Arial" w:hAnsi="Arial"/>
                 <w:i/>
-                <w:color w:val="5F6B76"/>
-                <w:sz w:val="21"/>
+                <w:color w:val="000000"/>
+                <w:sz w:val="20"/>
               </w:rPr>
               <w:t>Insert a terminal screenshot showing both FK tests or their final PASS values.</w:t>
             </w:r>
@@ -758,6 +754,10 @@
     </w:tbl>
     <w:p>
       <w:r>
+        <w:rPr>
+          <w:rFonts w:ascii="Arial" w:hAnsi="Arial"/>
+          <w:color w:val="000000"/>
+        </w:rPr>
         <w:br w:type="page"/>
       </w:r>
     </w:p>
@@ -766,7 +766,11 @@
         <w:pStyle w:val="Heading1"/>
       </w:pPr>
       <w:r>
-        <w:t>3. Predictions Before Webots</w:t>
+        <w:rPr>
+          <w:rFonts w:ascii="Arial" w:hAnsi="Arial"/>
+          <w:color w:val="000000"/>
+        </w:rPr>
+        <w:t>3. FK predictions before Webots</w:t>
       </w:r>
     </w:p>
     <w:tbl>
@@ -776,12 +780,12 @@
         <w:tblLook w:firstColumn="1" w:firstRow="1" w:lastColumn="0" w:lastRow="0" w:noHBand="0" w:noVBand="1" w:val="04A0"/>
         <w:tblInd w:w="120" w:type="dxa"/>
         <w:tblBorders>
-          <w:top w:val="single" w:sz="6" w:color="B7C5D5"/>
-          <w:left w:val="single" w:sz="6" w:color="B7C5D5"/>
-          <w:bottom w:val="single" w:sz="6" w:color="B7C5D5"/>
-          <w:right w:val="single" w:sz="6" w:color="B7C5D5"/>
-          <w:insideH w:val="single" w:sz="6" w:color="B7C5D5"/>
-          <w:insideV w:val="single" w:sz="6" w:color="B7C5D5"/>
+          <w:top w:val="single" w:sz="4" w:color="D9D9D9"/>
+          <w:left w:val="single" w:sz="4" w:color="D9D9D9"/>
+          <w:bottom w:val="single" w:sz="4" w:color="D9D9D9"/>
+          <w:right w:val="single" w:sz="4" w:color="D9D9D9"/>
+          <w:insideH w:val="single" w:sz="4" w:color="D9D9D9"/>
+          <w:insideV w:val="single" w:sz="4" w:color="D9D9D9"/>
         </w:tblBorders>
       </w:tblPr>
       <w:tblGrid>
@@ -797,7 +801,7 @@
               <w:bottom w:w="100" w:type="dxa"/>
               <w:end w:w="120" w:type="dxa"/>
             </w:tcMar>
-            <w:shd w:fill="F4F6F9"/>
+            <w:shd w:fill="FFFFFF"/>
           </w:tcPr>
           <w:p>
             <w:pPr>
@@ -805,20 +809,12 @@
             </w:pPr>
             <w:r>
               <w:rPr>
-                <w:rFonts w:ascii="Calibri" w:hAnsi="Calibri"/>
-                <w:b/>
-                <w:color w:val="0B2545"/>
-                <w:sz w:val="21"/>
+                <w:rFonts w:ascii="Arial" w:hAnsi="Arial"/>
+                <w:i/>
+                <w:color w:val="000000"/>
+                <w:sz w:val="20"/>
               </w:rPr>
-              <w:t xml:space="preserve">Important: </w:t>
-            </w:r>
-            <w:r>
-              <w:rPr>
-                <w:rFonts w:ascii="Calibri" w:hAnsi="Calibri"/>
-                <w:color w:val="0B2545"/>
-                <w:sz w:val="21"/>
-              </w:rPr>
-              <w:t>Run predict_fk_poses.py and save this output before running the Webots fk_experiment controller.</w:t>
+              <w:t>Run predict_fk_poses.py before running the Webots motion experiment.</w:t>
             </w:r>
           </w:p>
         </w:tc>
@@ -830,9 +826,9 @@
       </w:pPr>
       <w:r>
         <w:rPr>
-          <w:rFonts w:ascii="Calibri" w:hAnsi="Calibri"/>
+          <w:rFonts w:ascii="Arial" w:hAnsi="Arial"/>
           <w:b/>
-          <w:color w:val="1F4D78"/>
+          <w:color w:val="000000"/>
           <w:sz w:val="21"/>
         </w:rPr>
         <w:t>FK prediction output for A, B, and C</w:t>
@@ -845,12 +841,12 @@
         <w:tblLook w:firstColumn="1" w:firstRow="1" w:lastColumn="0" w:lastRow="0" w:noHBand="0" w:noVBand="1" w:val="04A0"/>
         <w:tblInd w:w="120" w:type="dxa"/>
         <w:tblBorders>
-          <w:top w:val="single" w:sz="6" w:color="B7C5D5"/>
-          <w:left w:val="single" w:sz="6" w:color="B7C5D5"/>
-          <w:bottom w:val="single" w:sz="6" w:color="B7C5D5"/>
-          <w:right w:val="single" w:sz="6" w:color="B7C5D5"/>
-          <w:insideH w:val="single" w:sz="6" w:color="B7C5D5"/>
-          <w:insideV w:val="single" w:sz="6" w:color="B7C5D5"/>
+          <w:top w:val="single" w:sz="4" w:color="D9D9D9"/>
+          <w:left w:val="single" w:sz="4" w:color="D9D9D9"/>
+          <w:bottom w:val="single" w:sz="4" w:color="D9D9D9"/>
+          <w:right w:val="single" w:sz="4" w:color="D9D9D9"/>
+          <w:insideH w:val="single" w:sz="4" w:color="D9D9D9"/>
+          <w:insideV w:val="single" w:sz="4" w:color="D9D9D9"/>
         </w:tblBorders>
       </w:tblPr>
       <w:tblGrid>
@@ -870,7 +866,7 @@
               <w:end w:w="120" w:type="dxa"/>
             </w:tcMar>
             <w:vAlign w:val="top"/>
-            <w:shd w:fill="F4F6F9"/>
+            <w:shd w:fill="FFFFFF"/>
           </w:tcPr>
           <w:p>
             <w:pPr>
@@ -880,7 +876,7 @@
               <w:rPr>
                 <w:rFonts w:ascii="Consolas" w:hAnsi="Consolas"/>
                 <w:i/>
-                <w:color w:val="5F6B76"/>
+                <w:color w:val="000000"/>
                 <w:sz w:val="19"/>
               </w:rPr>
               <w:t>Paste the complete predict_fk_poses.py terminal output here.</w:t>
@@ -895,12 +891,10 @@
       </w:pPr>
       <w:r>
         <w:rPr>
-          <w:rFonts w:ascii="Calibri" w:hAnsi="Calibri"/>
-          <w:b/>
-          <w:color w:val="1F4D78"/>
-          <w:sz w:val="21"/>
+          <w:rFonts w:ascii="Arial" w:hAnsi="Arial"/>
+          <w:color w:val="000000"/>
         </w:rPr>
-        <w:t>Prediction evidence</w:t>
+        <w:t>Screenshot</w:t>
       </w:r>
     </w:p>
     <w:tbl>
@@ -910,12 +904,12 @@
         <w:tblLook w:firstColumn="1" w:firstRow="1" w:lastColumn="0" w:lastRow="0" w:noHBand="0" w:noVBand="1" w:val="04A0"/>
         <w:tblInd w:w="120" w:type="dxa"/>
         <w:tblBorders>
-          <w:top w:val="single" w:sz="6" w:color="B7C5D5"/>
-          <w:left w:val="single" w:sz="6" w:color="B7C5D5"/>
-          <w:bottom w:val="single" w:sz="6" w:color="B7C5D5"/>
-          <w:right w:val="single" w:sz="6" w:color="B7C5D5"/>
-          <w:insideH w:val="single" w:sz="6" w:color="B7C5D5"/>
-          <w:insideV w:val="single" w:sz="6" w:color="B7C5D5"/>
+          <w:top w:val="single" w:sz="4" w:color="D9D9D9"/>
+          <w:left w:val="single" w:sz="4" w:color="D9D9D9"/>
+          <w:bottom w:val="single" w:sz="4" w:color="D9D9D9"/>
+          <w:right w:val="single" w:sz="4" w:color="D9D9D9"/>
+          <w:insideH w:val="single" w:sz="4" w:color="D9D9D9"/>
+          <w:insideV w:val="single" w:sz="4" w:color="D9D9D9"/>
         </w:tblBorders>
       </w:tblPr>
       <w:tblGrid>
@@ -943,20 +937,21 @@
             </w:pPr>
             <w:r>
               <w:rPr>
-                <w:rFonts w:ascii="Calibri" w:hAnsi="Calibri"/>
+                <w:rFonts w:ascii="Arial" w:hAnsi="Arial"/>
                 <w:b/>
-                <w:color w:val="2E74B5"/>
-                <w:sz w:val="21"/>
+                <w:i/>
+                <w:color w:val="000000"/>
+                <w:sz w:val="20"/>
               </w:rPr>
               <w:t>SCREENSHOT PLACEHOLDER</w:t>
               <w:br/>
             </w:r>
             <w:r>
               <w:rPr>
-                <w:rFonts w:ascii="Calibri" w:hAnsi="Calibri"/>
+                <w:rFonts w:ascii="Arial" w:hAnsi="Arial"/>
                 <w:i/>
-                <w:color w:val="5F6B76"/>
-                <w:sz w:val="21"/>
+                <w:color w:val="000000"/>
+                <w:sz w:val="20"/>
               </w:rPr>
               <w:t>Insert a screenshot of the prediction-program output.</w:t>
             </w:r>
@@ -969,7 +964,11 @@
         <w:pStyle w:val="Heading1"/>
       </w:pPr>
       <w:r>
-        <w:t>4. Webots Motion and Measurements</w:t>
+        <w:rPr>
+          <w:rFonts w:ascii="Arial" w:hAnsi="Arial"/>
+          <w:color w:val="000000"/>
+        </w:rPr>
+        <w:t>4. Webots motion and measurements</w:t>
       </w:r>
     </w:p>
     <w:p>
@@ -978,9 +977,9 @@
       </w:pPr>
       <w:r>
         <w:rPr>
-          <w:rFonts w:ascii="Calibri" w:hAnsi="Calibri"/>
+          <w:rFonts w:ascii="Arial" w:hAnsi="Arial"/>
           <w:b/>
-          <w:color w:val="1F4D78"/>
+          <w:color w:val="000000"/>
           <w:sz w:val="21"/>
         </w:rPr>
         <w:t>Webots output for A, B, and C</w:t>
@@ -993,12 +992,12 @@
         <w:tblLook w:firstColumn="1" w:firstRow="1" w:lastColumn="0" w:lastRow="0" w:noHBand="0" w:noVBand="1" w:val="04A0"/>
         <w:tblInd w:w="120" w:type="dxa"/>
         <w:tblBorders>
-          <w:top w:val="single" w:sz="6" w:color="B7C5D5"/>
-          <w:left w:val="single" w:sz="6" w:color="B7C5D5"/>
-          <w:bottom w:val="single" w:sz="6" w:color="B7C5D5"/>
-          <w:right w:val="single" w:sz="6" w:color="B7C5D5"/>
-          <w:insideH w:val="single" w:sz="6" w:color="B7C5D5"/>
-          <w:insideV w:val="single" w:sz="6" w:color="B7C5D5"/>
+          <w:top w:val="single" w:sz="4" w:color="D9D9D9"/>
+          <w:left w:val="single" w:sz="4" w:color="D9D9D9"/>
+          <w:bottom w:val="single" w:sz="4" w:color="D9D9D9"/>
+          <w:right w:val="single" w:sz="4" w:color="D9D9D9"/>
+          <w:insideH w:val="single" w:sz="4" w:color="D9D9D9"/>
+          <w:insideV w:val="single" w:sz="4" w:color="D9D9D9"/>
         </w:tblBorders>
       </w:tblPr>
       <w:tblGrid>
@@ -1018,7 +1017,7 @@
               <w:end w:w="120" w:type="dxa"/>
             </w:tcMar>
             <w:vAlign w:val="top"/>
-            <w:shd w:fill="F4F6F9"/>
+            <w:shd w:fill="FFFFFF"/>
           </w:tcPr>
           <w:p>
             <w:pPr>
@@ -1028,7 +1027,7 @@
               <w:rPr>
                 <w:rFonts w:ascii="Consolas" w:hAnsi="Consolas"/>
                 <w:i/>
-                <w:color w:val="5F6B76"/>
+                <w:color w:val="000000"/>
                 <w:sz w:val="19"/>
               </w:rPr>
               <w:t>Paste the measured q, tool position, and tool RPY blocks printed by fk_experiment here.</w:t>
@@ -1039,6 +1038,10 @@
     </w:tbl>
     <w:p>
       <w:r>
+        <w:rPr>
+          <w:rFonts w:ascii="Arial" w:hAnsi="Arial"/>
+          <w:color w:val="000000"/>
+        </w:rPr>
         <w:br w:type="page"/>
       </w:r>
     </w:p>
@@ -1047,7 +1050,11 @@
         <w:pStyle w:val="Heading1"/>
       </w:pPr>
       <w:r>
-        <w:t>5. FK-to-Webots Comparison</w:t>
+        <w:rPr>
+          <w:rFonts w:ascii="Arial" w:hAnsi="Arial"/>
+          <w:color w:val="000000"/>
+        </w:rPr>
+        <w:t>5. Compare FK with Webots</w:t>
       </w:r>
     </w:p>
     <w:p>
@@ -1056,9 +1063,9 @@
       </w:pPr>
       <w:r>
         <w:rPr>
-          <w:rFonts w:ascii="Calibri" w:hAnsi="Calibri"/>
+          <w:rFonts w:ascii="Arial" w:hAnsi="Arial"/>
           <w:b/>
-          <w:color w:val="1F4D78"/>
+          <w:color w:val="000000"/>
           <w:sz w:val="21"/>
         </w:rPr>
         <w:t>Comparison-program output</w:t>
@@ -1071,12 +1078,12 @@
         <w:tblLook w:firstColumn="1" w:firstRow="1" w:lastColumn="0" w:lastRow="0" w:noHBand="0" w:noVBand="1" w:val="04A0"/>
         <w:tblInd w:w="120" w:type="dxa"/>
         <w:tblBorders>
-          <w:top w:val="single" w:sz="6" w:color="B7C5D5"/>
-          <w:left w:val="single" w:sz="6" w:color="B7C5D5"/>
-          <w:bottom w:val="single" w:sz="6" w:color="B7C5D5"/>
-          <w:right w:val="single" w:sz="6" w:color="B7C5D5"/>
-          <w:insideH w:val="single" w:sz="6" w:color="B7C5D5"/>
-          <w:insideV w:val="single" w:sz="6" w:color="B7C5D5"/>
+          <w:top w:val="single" w:sz="4" w:color="D9D9D9"/>
+          <w:left w:val="single" w:sz="4" w:color="D9D9D9"/>
+          <w:bottom w:val="single" w:sz="4" w:color="D9D9D9"/>
+          <w:right w:val="single" w:sz="4" w:color="D9D9D9"/>
+          <w:insideH w:val="single" w:sz="4" w:color="D9D9D9"/>
+          <w:insideV w:val="single" w:sz="4" w:color="D9D9D9"/>
         </w:tblBorders>
       </w:tblPr>
       <w:tblGrid>
@@ -1096,7 +1103,7 @@
               <w:end w:w="120" w:type="dxa"/>
             </w:tcMar>
             <w:vAlign w:val="top"/>
-            <w:shd w:fill="F4F6F9"/>
+            <w:shd w:fill="FFFFFF"/>
           </w:tcPr>
           <w:p>
             <w:pPr>
@@ -1104,10 +1111,10 @@
             </w:pPr>
             <w:r>
               <w:rPr>
-                <w:rFonts w:ascii="Consolas" w:hAnsi="Consolas"/>
+                <w:rFonts w:ascii="Arial" w:hAnsi="Arial"/>
                 <w:i/>
-                <w:color w:val="5F6B76"/>
-                <w:sz w:val="19"/>
+                <w:color w:val="000000"/>
+                <w:sz w:val="20"/>
               </w:rPr>
               <w:t>Run compare_fk_with_webots.py, enter the Webots measurements, and paste its complete per-pose and summary output here.</w:t>
             </w:r>
@@ -1121,12 +1128,10 @@
       </w:pPr>
       <w:r>
         <w:rPr>
-          <w:rFonts w:ascii="Calibri" w:hAnsi="Calibri"/>
-          <w:b/>
-          <w:color w:val="1F4D78"/>
-          <w:sz w:val="21"/>
+          <w:rFonts w:ascii="Arial" w:hAnsi="Arial"/>
+          <w:color w:val="000000"/>
         </w:rPr>
-        <w:t>Robot and comparison evidence</w:t>
+        <w:t>Screenshots</w:t>
       </w:r>
     </w:p>
     <w:tbl>
@@ -1136,12 +1141,12 @@
         <w:tblLook w:firstColumn="1" w:firstRow="1" w:lastColumn="0" w:lastRow="0" w:noHBand="0" w:noVBand="1" w:val="04A0"/>
         <w:tblInd w:w="120" w:type="dxa"/>
         <w:tblBorders>
-          <w:top w:val="single" w:sz="6" w:color="B7C5D5"/>
-          <w:left w:val="single" w:sz="6" w:color="B7C5D5"/>
-          <w:bottom w:val="single" w:sz="6" w:color="B7C5D5"/>
-          <w:right w:val="single" w:sz="6" w:color="B7C5D5"/>
-          <w:insideH w:val="single" w:sz="6" w:color="B7C5D5"/>
-          <w:insideV w:val="single" w:sz="6" w:color="B7C5D5"/>
+          <w:top w:val="single" w:sz="4" w:color="D9D9D9"/>
+          <w:left w:val="single" w:sz="4" w:color="D9D9D9"/>
+          <w:bottom w:val="single" w:sz="4" w:color="D9D9D9"/>
+          <w:right w:val="single" w:sz="4" w:color="D9D9D9"/>
+          <w:insideH w:val="single" w:sz="4" w:color="D9D9D9"/>
+          <w:insideV w:val="single" w:sz="4" w:color="D9D9D9"/>
         </w:tblBorders>
       </w:tblPr>
       <w:tblGrid>
@@ -1169,20 +1174,21 @@
             </w:pPr>
             <w:r>
               <w:rPr>
-                <w:rFonts w:ascii="Calibri" w:hAnsi="Calibri"/>
+                <w:rFonts w:ascii="Arial" w:hAnsi="Arial"/>
                 <w:b/>
-                <w:color w:val="2E74B5"/>
-                <w:sz w:val="21"/>
+                <w:i/>
+                <w:color w:val="000000"/>
+                <w:sz w:val="20"/>
               </w:rPr>
               <w:t>SCREENSHOT PLACEHOLDER</w:t>
               <w:br/>
             </w:r>
             <w:r>
               <w:rPr>
-                <w:rFonts w:ascii="Calibri" w:hAnsi="Calibri"/>
+                <w:rFonts w:ascii="Arial" w:hAnsi="Arial"/>
                 <w:i/>
-                <w:color w:val="5F6B76"/>
-                <w:sz w:val="21"/>
+                <w:color w:val="000000"/>
+                <w:sz w:val="20"/>
               </w:rPr>
               <w:t>Insert one Webots screenshot showing the robot/stylus at a measured pose and one screenshot of the comparison summary. Resize as needed.</w:t>
             </w:r>
@@ -1195,7 +1201,11 @@
         <w:pStyle w:val="Heading1"/>
       </w:pPr>
       <w:r>
-        <w:t>6. Interpretation</w:t>
+        <w:rPr>
+          <w:rFonts w:ascii="Arial" w:hAnsi="Arial"/>
+          <w:color w:val="000000"/>
+        </w:rPr>
+        <w:t>6. What do the results show?</w:t>
       </w:r>
     </w:p>
     <w:p>
@@ -1204,12 +1214,10 @@
       </w:pPr>
       <w:r>
         <w:rPr>
-          <w:rFonts w:ascii="Calibri" w:hAnsi="Calibri"/>
-          <w:b/>
-          <w:color w:val="1F4D78"/>
-          <w:sz w:val="21"/>
+          <w:rFonts w:ascii="Arial" w:hAnsi="Arial"/>
+          <w:color w:val="000000"/>
         </w:rPr>
-        <w:t>What do the results show?</w:t>
+        <w:t>Short explanation</w:t>
       </w:r>
     </w:p>
     <w:tbl>
@@ -1219,12 +1227,12 @@
         <w:tblLook w:firstColumn="1" w:firstRow="1" w:lastColumn="0" w:lastRow="0" w:noHBand="0" w:noVBand="1" w:val="04A0"/>
         <w:tblInd w:w="120" w:type="dxa"/>
         <w:tblBorders>
-          <w:top w:val="single" w:sz="6" w:color="B7C5D5"/>
-          <w:left w:val="single" w:sz="6" w:color="B7C5D5"/>
-          <w:bottom w:val="single" w:sz="6" w:color="B7C5D5"/>
-          <w:right w:val="single" w:sz="6" w:color="B7C5D5"/>
-          <w:insideH w:val="single" w:sz="6" w:color="B7C5D5"/>
-          <w:insideV w:val="single" w:sz="6" w:color="B7C5D5"/>
+          <w:top w:val="single" w:sz="4" w:color="D9D9D9"/>
+          <w:left w:val="single" w:sz="4" w:color="D9D9D9"/>
+          <w:bottom w:val="single" w:sz="4" w:color="D9D9D9"/>
+          <w:right w:val="single" w:sz="4" w:color="D9D9D9"/>
+          <w:insideH w:val="single" w:sz="4" w:color="D9D9D9"/>
+          <w:insideV w:val="single" w:sz="4" w:color="D9D9D9"/>
         </w:tblBorders>
       </w:tblPr>
       <w:tblGrid>
@@ -1244,7 +1252,7 @@
               <w:end w:w="120" w:type="dxa"/>
             </w:tcMar>
             <w:vAlign w:val="top"/>
-            <w:shd w:fill="F4F6F9"/>
+            <w:shd w:fill="FFFFFF"/>
           </w:tcPr>
           <w:p>
             <w:pPr>
@@ -1252,10 +1260,10 @@
             </w:pPr>
             <w:r>
               <w:rPr>
-                <w:rFonts w:ascii="Calibri" w:hAnsi="Calibri"/>
+                <w:rFonts w:ascii="Arial" w:hAnsi="Arial"/>
                 <w:i/>
-                <w:color w:val="5F6B76"/>
-                <w:sz w:val="21"/>
+                <w:color w:val="000000"/>
+                <w:sz w:val="20"/>
               </w:rPr>
               <w:t>In 3-5 sentences, state whether the joints reached their targets, whether FK agreed with Webots, which pose had the largest error, and the likely cause of any important discrepancy.</w:t>
             </w:r>
@@ -1268,7 +1276,11 @@
         <w:pStyle w:val="Heading2"/>
       </w:pPr>
       <w:r>
-        <w:t>Submission Check</w:t>
+        <w:rPr>
+          <w:rFonts w:ascii="Arial" w:hAnsi="Arial"/>
+          <w:color w:val="000000"/>
+        </w:rPr>
+        <w:t>Before submitting</w:t>
       </w:r>
     </w:p>
     <w:p>
@@ -1277,12 +1289,10 @@
       </w:pPr>
       <w:r>
         <w:rPr>
-          <w:rFonts w:ascii="Calibri" w:hAnsi="Calibri"/>
-          <w:b/>
-          <w:color w:val="1F4D78"/>
-          <w:sz w:val="21"/>
+          <w:rFonts w:ascii="Arial" w:hAnsi="Arial"/>
+          <w:color w:val="000000"/>
         </w:rPr>
-        <w:t>Final check</w:t>
+        <w:t>Check your report</w:t>
       </w:r>
     </w:p>
     <w:tbl>
@@ -1292,12 +1302,12 @@
         <w:tblLook w:firstColumn="1" w:firstRow="1" w:lastColumn="0" w:lastRow="0" w:noHBand="0" w:noVBand="1" w:val="04A0"/>
         <w:tblInd w:w="120" w:type="dxa"/>
         <w:tblBorders>
-          <w:top w:val="single" w:sz="6" w:color="B7C5D5"/>
-          <w:left w:val="single" w:sz="6" w:color="B7C5D5"/>
-          <w:bottom w:val="single" w:sz="6" w:color="B7C5D5"/>
-          <w:right w:val="single" w:sz="6" w:color="B7C5D5"/>
-          <w:insideH w:val="single" w:sz="6" w:color="B7C5D5"/>
-          <w:insideV w:val="single" w:sz="6" w:color="B7C5D5"/>
+          <w:top w:val="single" w:sz="4" w:color="D9D9D9"/>
+          <w:left w:val="single" w:sz="4" w:color="D9D9D9"/>
+          <w:bottom w:val="single" w:sz="4" w:color="D9D9D9"/>
+          <w:right w:val="single" w:sz="4" w:color="D9D9D9"/>
+          <w:insideH w:val="single" w:sz="4" w:color="D9D9D9"/>
+          <w:insideV w:val="single" w:sz="4" w:color="D9D9D9"/>
         </w:tblBorders>
       </w:tblPr>
       <w:tblGrid>
@@ -1317,7 +1327,7 @@
               <w:end w:w="120" w:type="dxa"/>
             </w:tcMar>
             <w:vAlign w:val="top"/>
-            <w:shd w:fill="F4F6F9"/>
+            <w:shd w:fill="FFFFFF"/>
           </w:tcPr>
           <w:p>
             <w:pPr>
@@ -1325,12 +1335,12 @@
             </w:pPr>
             <w:r>
               <w:rPr>
-                <w:rFonts w:ascii="Calibri" w:hAnsi="Calibri"/>
+                <w:rFonts w:ascii="Arial" w:hAnsi="Arial"/>
                 <w:i/>
-                <w:color w:val="5F6B76"/>
-                <w:sz w:val="21"/>
+                <w:color w:val="000000"/>
+                <w:sz w:val="20"/>
               </w:rPr>
-              <w:t>Confirm that student information, text outputs, screenshots, and interpretation are complete and that this file is saved as .docx.</w:t>
+              <w:t>Check that your name, output, screenshots, and explanation are included. Save the file as .docx.</w:t>
             </w:r>
           </w:p>
         </w:tc>
@@ -1355,17 +1365,7 @@
       <w:pStyle w:val="Footer"/>
       <w:jc w:val="right"/>
     </w:pPr>
-    <w:r>
-      <w:rPr>
-        <w:rFonts w:ascii="Calibri" w:hAnsi="Calibri"/>
-        <w:color w:val="5F6B76"/>
-        <w:sz w:val="18"/>
-      </w:rPr>
-      <w:t xml:space="preserve">Page </w:t>
-      <w:fldChar w:fldCharType="begin"/>
-      <w:instrText xml:space="preserve">PAGE</w:instrText>
-      <w:fldChar w:fldCharType="end"/>
-    </w:r>
+    <w:r/>
   </w:p>
 </w:ftr>
 </file>
@@ -1376,15 +1376,7 @@
     <w:pPr>
       <w:pStyle w:val="Header"/>
     </w:pPr>
-    <w:r>
-      <w:rPr>
-        <w:rFonts w:ascii="Calibri" w:hAnsi="Calibri"/>
-        <w:b/>
-        <w:color w:val="5F6B76"/>
-        <w:sz w:val="18"/>
-      </w:rPr>
-      <w:t>EEL 4664  |  Lab 2 Report</w:t>
-    </w:r>
+    <w:r/>
   </w:p>
 </w:hdr>
 </file>
@@ -1753,10 +1745,10 @@
     <w:qFormat/>
     <w:rsid w:val="00FC693F"/>
     <w:pPr>
-      <w:spacing w:after="120" w:line="300" w:lineRule="auto"/>
+      <w:spacing w:after="120" w:line="276" w:lineRule="auto"/>
     </w:pPr>
     <w:rPr>
-      <w:rFonts w:ascii="Calibri" w:hAnsi="Calibri"/>
+      <w:rFonts w:ascii="Arial" w:hAnsi="Arial"/>
       <w:sz w:val="22"/>
     </w:rPr>
   </w:style>
@@ -1815,14 +1807,14 @@
     <w:pPr>
       <w:keepNext/>
       <w:keepLines/>
-      <w:spacing w:before="360" w:after="200"/>
+      <w:spacing w:before="320" w:after="100"/>
       <w:outlineLvl w:val="0"/>
     </w:pPr>
     <w:rPr>
-      <w:rFonts w:asciiTheme="majorHAnsi" w:eastAsiaTheme="majorEastAsia" w:hAnsiTheme="majorHAnsi" w:cstheme="majorBidi" w:ascii="Calibri" w:hAnsi="Calibri"/>
+      <w:rFonts w:asciiTheme="majorHAnsi" w:eastAsiaTheme="majorEastAsia" w:hAnsiTheme="majorHAnsi" w:cstheme="majorBidi" w:ascii="Arial" w:hAnsi="Arial"/>
       <w:b/>
       <w:bCs/>
-      <w:color w:val="2E74B5"/>
+      <w:color w:val="000000"/>
       <w:sz w:val="32"/>
       <w:szCs w:val="28"/>
     </w:rPr>
@@ -1839,14 +1831,14 @@
     <w:pPr>
       <w:keepNext/>
       <w:keepLines/>
-      <w:spacing w:before="280" w:after="140"/>
+      <w:spacing w:before="240" w:after="80"/>
       <w:outlineLvl w:val="1"/>
     </w:pPr>
     <w:rPr>
-      <w:rFonts w:asciiTheme="majorHAnsi" w:eastAsiaTheme="majorEastAsia" w:hAnsiTheme="majorHAnsi" w:cstheme="majorBidi" w:ascii="Calibri" w:hAnsi="Calibri"/>
+      <w:rFonts w:asciiTheme="majorHAnsi" w:eastAsiaTheme="majorEastAsia" w:hAnsiTheme="majorHAnsi" w:cstheme="majorBidi" w:ascii="Arial" w:hAnsi="Arial"/>
       <w:b/>
       <w:bCs/>
-      <w:color w:val="2E74B5"/>
+      <w:color w:val="000000"/>
       <w:sz w:val="26"/>
       <w:szCs w:val="26"/>
     </w:rPr>
@@ -1863,14 +1855,14 @@
     <w:pPr>
       <w:keepNext/>
       <w:keepLines/>
-      <w:spacing w:before="200" w:after="100"/>
+      <w:spacing w:before="200" w:after="80"/>
       <w:outlineLvl w:val="2"/>
     </w:pPr>
     <w:rPr>
-      <w:rFonts w:asciiTheme="majorHAnsi" w:eastAsiaTheme="majorEastAsia" w:hAnsiTheme="majorHAnsi" w:cstheme="majorBidi" w:ascii="Calibri" w:hAnsi="Calibri"/>
+      <w:rFonts w:asciiTheme="majorHAnsi" w:eastAsiaTheme="majorEastAsia" w:hAnsiTheme="majorHAnsi" w:cstheme="majorBidi" w:ascii="Arial" w:hAnsi="Arial"/>
       <w:b/>
       <w:bCs/>
-      <w:color w:val="1F4D78"/>
+      <w:color w:val="000000"/>
       <w:sz w:val="24"/>
     </w:rPr>
   </w:style>

</xml_diff>

<commit_message>
Update Lab 2 report template to improve structure and clarity of sections (remove diagnostic section)
</commit_message>
<xml_diff>
--- a/lab02_webots_ur5e_frames/Lab02_Report_Template.docx
+++ b/lab02_webots_ur5e_frames/Lab02_Report_Template.docx
@@ -249,236 +249,7 @@
         <w:pStyle w:val="Heading1"/>
       </w:pPr>
       <w:r>
-        <w:rPr>
-          <w:rFonts w:ascii="Arial" w:hAnsi="Arial"/>
-          <w:color w:val="000000"/>
-        </w:rPr>
-        <w:t>1. Webots diagnostics</w:t>
-      </w:r>
-    </w:p>
-    <w:p>
-      <w:pPr>
-        <w:spacing w:before="80" w:after="60"/>
-      </w:pPr>
-      <w:r>
-        <w:rPr>
-          <w:rFonts w:ascii="Arial" w:hAnsi="Arial"/>
-          <w:b/>
-          <w:color w:val="000000"/>
-          <w:sz w:val="21"/>
-        </w:rPr>
-        <w:t>Minimal-controller result</w:t>
-      </w:r>
-    </w:p>
-    <w:tbl>
-      <w:tblPr>
-        <w:tblW w:type="dxa" w:w="9360"/>
-        <w:tblLayout w:type="fixed"/>
-        <w:tblLook w:firstColumn="1" w:firstRow="1" w:lastColumn="0" w:lastRow="0" w:noHBand="0" w:noVBand="1" w:val="04A0"/>
-        <w:tblInd w:w="120" w:type="dxa"/>
-        <w:tblBorders>
-          <w:top w:val="single" w:sz="4" w:color="D9D9D9"/>
-          <w:left w:val="single" w:sz="4" w:color="D9D9D9"/>
-          <w:bottom w:val="single" w:sz="4" w:color="D9D9D9"/>
-          <w:right w:val="single" w:sz="4" w:color="D9D9D9"/>
-          <w:insideH w:val="single" w:sz="4" w:color="D9D9D9"/>
-          <w:insideV w:val="single" w:sz="4" w:color="D9D9D9"/>
-        </w:tblBorders>
-      </w:tblPr>
-      <w:tblGrid>
-        <w:gridCol w:w="9360"/>
-      </w:tblGrid>
-      <w:tr>
-        <w:trPr>
-          <w:trHeight w:val="1008" w:hRule="atLeast"/>
-        </w:trPr>
-        <w:tc>
-          <w:tcPr>
-            <w:tcW w:type="dxa" w:w="9360"/>
-            <w:tcMar>
-              <w:top w:w="100" w:type="dxa"/>
-              <w:start w:w="120" w:type="dxa"/>
-              <w:bottom w:w="100" w:type="dxa"/>
-              <w:end w:w="120" w:type="dxa"/>
-            </w:tcMar>
-            <w:vAlign w:val="top"/>
-            <w:shd w:fill="FFFFFF"/>
-          </w:tcPr>
-          <w:p>
-            <w:pPr>
-              <w:spacing w:after="0"/>
-            </w:pPr>
-            <w:r>
-              <w:rPr>
-                <w:rFonts w:ascii="Consolas" w:hAnsi="Consolas"/>
-                <w:i/>
-                <w:color w:val="000000"/>
-                <w:sz w:val="19"/>
-              </w:rPr>
-              <w:t>Paste the diagnostic_minimal Console output here.</w:t>
-            </w:r>
-          </w:p>
-        </w:tc>
-      </w:tr>
-    </w:tbl>
-    <w:p>
-      <w:pPr>
-        <w:spacing w:before="80" w:after="60"/>
-      </w:pPr>
-      <w:r>
-        <w:rPr>
-          <w:rFonts w:ascii="Arial" w:hAnsi="Arial"/>
-          <w:b/>
-          <w:color w:val="000000"/>
-          <w:sz w:val="21"/>
-        </w:rPr>
-        <w:t>Device-listing result</w:t>
-      </w:r>
-    </w:p>
-    <w:tbl>
-      <w:tblPr>
-        <w:tblW w:type="dxa" w:w="9360"/>
-        <w:tblLayout w:type="fixed"/>
-        <w:tblLook w:firstColumn="1" w:firstRow="1" w:lastColumn="0" w:lastRow="0" w:noHBand="0" w:noVBand="1" w:val="04A0"/>
-        <w:tblInd w:w="120" w:type="dxa"/>
-        <w:tblBorders>
-          <w:top w:val="single" w:sz="4" w:color="D9D9D9"/>
-          <w:left w:val="single" w:sz="4" w:color="D9D9D9"/>
-          <w:bottom w:val="single" w:sz="4" w:color="D9D9D9"/>
-          <w:right w:val="single" w:sz="4" w:color="D9D9D9"/>
-          <w:insideH w:val="single" w:sz="4" w:color="D9D9D9"/>
-          <w:insideV w:val="single" w:sz="4" w:color="D9D9D9"/>
-        </w:tblBorders>
-      </w:tblPr>
-      <w:tblGrid>
-        <w:gridCol w:w="9360"/>
-      </w:tblGrid>
-      <w:tr>
-        <w:trPr>
-          <w:trHeight w:val="1008" w:hRule="atLeast"/>
-        </w:trPr>
-        <w:tc>
-          <w:tcPr>
-            <w:tcW w:type="dxa" w:w="9360"/>
-            <w:tcMar>
-              <w:top w:w="100" w:type="dxa"/>
-              <w:start w:w="120" w:type="dxa"/>
-              <w:bottom w:w="100" w:type="dxa"/>
-              <w:end w:w="120" w:type="dxa"/>
-            </w:tcMar>
-            <w:vAlign w:val="top"/>
-            <w:shd w:fill="FFFFFF"/>
-          </w:tcPr>
-          <w:p>
-            <w:pPr>
-              <w:spacing w:after="0"/>
-            </w:pPr>
-            <w:r>
-              <w:rPr>
-                <w:rFonts w:ascii="Consolas" w:hAnsi="Consolas"/>
-                <w:i/>
-                <w:color w:val="000000"/>
-                <w:sz w:val="19"/>
-              </w:rPr>
-              <w:t>Paste the diagnostic_devices PASS line and any missing-device message here.</w:t>
-            </w:r>
-          </w:p>
-        </w:tc>
-      </w:tr>
-    </w:tbl>
-    <w:p>
-      <w:pPr>
-        <w:spacing w:before="80" w:after="60"/>
-      </w:pPr>
-      <w:r>
-        <w:rPr>
-          <w:rFonts w:ascii="Arial" w:hAnsi="Arial"/>
-          <w:color w:val="000000"/>
-        </w:rPr>
-        <w:t>Screenshot</w:t>
-      </w:r>
-    </w:p>
-    <w:tbl>
-      <w:tblPr>
-        <w:tblW w:type="dxa" w:w="9360"/>
-        <w:tblLayout w:type="fixed"/>
-        <w:tblLook w:firstColumn="1" w:firstRow="1" w:lastColumn="0" w:lastRow="0" w:noHBand="0" w:noVBand="1" w:val="04A0"/>
-        <w:tblInd w:w="120" w:type="dxa"/>
-        <w:tblBorders>
-          <w:top w:val="single" w:sz="4" w:color="D9D9D9"/>
-          <w:left w:val="single" w:sz="4" w:color="D9D9D9"/>
-          <w:bottom w:val="single" w:sz="4" w:color="D9D9D9"/>
-          <w:right w:val="single" w:sz="4" w:color="D9D9D9"/>
-          <w:insideH w:val="single" w:sz="4" w:color="D9D9D9"/>
-          <w:insideV w:val="single" w:sz="4" w:color="D9D9D9"/>
-        </w:tblBorders>
-      </w:tblPr>
-      <w:tblGrid>
-        <w:gridCol w:w="9360"/>
-      </w:tblGrid>
-      <w:tr>
-        <w:trPr>
-          <w:trHeight w:val="1656" w:hRule="atLeast"/>
-        </w:trPr>
-        <w:tc>
-          <w:tcPr>
-            <w:tcW w:type="dxa" w:w="9360"/>
-            <w:tcMar>
-              <w:top w:w="100" w:type="dxa"/>
-              <w:start w:w="120" w:type="dxa"/>
-              <w:bottom w:w="100" w:type="dxa"/>
-              <w:end w:w="120" w:type="dxa"/>
-            </w:tcMar>
-            <w:vAlign w:val="center"/>
-          </w:tcPr>
-          <w:p>
-            <w:pPr>
-              <w:spacing w:after="0"/>
-              <w:jc w:val="center"/>
-            </w:pPr>
-            <w:r>
-              <w:rPr>
-                <w:rFonts w:ascii="Arial" w:hAnsi="Arial"/>
-                <w:b/>
-                <w:i/>
-                <w:color w:val="000000"/>
-                <w:sz w:val="20"/>
-              </w:rPr>
-              <w:t>SCREENSHOT PLACEHOLDER</w:t>
-              <w:br/>
-            </w:r>
-            <w:r>
-              <w:rPr>
-                <w:rFonts w:ascii="Arial" w:hAnsi="Arial"/>
-                <w:i/>
-                <w:color w:val="000000"/>
-                <w:sz w:val="20"/>
-              </w:rPr>
-              <w:t>Insert one screenshot showing the Webots Console after the device diagnostic.</w:t>
-            </w:r>
-          </w:p>
-        </w:tc>
-      </w:tr>
-    </w:tbl>
-    <w:p>
-      <w:r>
-        <w:rPr>
-          <w:rFonts w:ascii="Arial" w:hAnsi="Arial"/>
-          <w:color w:val="000000"/>
-        </w:rPr>
-        <w:br w:type="page"/>
-      </w:r>
-    </w:p>
-    <w:p>
-      <w:pPr>
-        <w:pStyle w:val="Heading1"/>
-      </w:pPr>
-      <w:r>
-        <w:rPr>
-          <w:rFonts w:ascii="Arial" w:hAnsi="Arial"/>
-          <w:color w:val="000000"/>
-        </w:rPr>
-        <w:t>2. Modified-DH entries and offline tests</w:t>
+        <w:t>1. Modified-DH entries and offline tests</w:t>
       </w:r>
     </w:p>
     <w:p>
@@ -766,11 +537,7 @@
         <w:pStyle w:val="Heading1"/>
       </w:pPr>
       <w:r>
-        <w:rPr>
-          <w:rFonts w:ascii="Arial" w:hAnsi="Arial"/>
-          <w:color w:val="000000"/>
-        </w:rPr>
-        <w:t>3. FK predictions before Webots</w:t>
+        <w:t>2. FK predictions before Webots</w:t>
       </w:r>
     </w:p>
     <w:tbl>
@@ -964,11 +731,7 @@
         <w:pStyle w:val="Heading1"/>
       </w:pPr>
       <w:r>
-        <w:rPr>
-          <w:rFonts w:ascii="Arial" w:hAnsi="Arial"/>
-          <w:color w:val="000000"/>
-        </w:rPr>
-        <w:t>4. Webots motion and measurements</w:t>
+        <w:t>3. Webots motion and measurements</w:t>
       </w:r>
     </w:p>
     <w:p>
@@ -1050,11 +813,7 @@
         <w:pStyle w:val="Heading1"/>
       </w:pPr>
       <w:r>
-        <w:rPr>
-          <w:rFonts w:ascii="Arial" w:hAnsi="Arial"/>
-          <w:color w:val="000000"/>
-        </w:rPr>
-        <w:t>5. Compare FK with Webots</w:t>
+        <w:t>4. Compare FK with Webots</w:t>
       </w:r>
     </w:p>
     <w:p>
@@ -1201,11 +960,7 @@
         <w:pStyle w:val="Heading1"/>
       </w:pPr>
       <w:r>
-        <w:rPr>
-          <w:rFonts w:ascii="Arial" w:hAnsi="Arial"/>
-          <w:color w:val="000000"/>
-        </w:rPr>
-        <w:t>6. What do the results show?</w:t>
+        <w:t>5. What do the results show?</w:t>
       </w:r>
     </w:p>
     <w:p>

</xml_diff>

<commit_message>
Refactor Lab 2 report template for clarity and consistency; remove comparison script and update README for qualitative analysis
</commit_message>
<xml_diff>
--- a/lab02_webots_ur5e_frames/Lab02_Report_Template.docx
+++ b/lab02_webots_ur5e_frames/Lab02_Report_Template.docx
@@ -813,7 +813,7 @@
         <w:pStyle w:val="Heading1"/>
       </w:pPr>
       <w:r>
-        <w:t>4. Compare FK with Webots</w:t>
+        <w:t>4. Qualitative comparison</w:t>
       </w:r>
     </w:p>
     <w:p>
@@ -827,7 +827,7 @@
           <w:color w:val="000000"/>
           <w:sz w:val="21"/>
         </w:rPr>
-        <w:t>Comparison-program output</w:t>
+        <w:t>Prediction versus Webots</w:t>
       </w:r>
     </w:p>
     <w:tbl>
@@ -875,7 +875,7 @@
                 <w:color w:val="000000"/>
                 <w:sz w:val="20"/>
               </w:rPr>
-              <w:t>Run compare_fk_with_webots.py, enter the Webots measurements, and paste its complete per-pose and summary output here.</w:t>
+              <w:t>In 3-5 sentences, compare the Step 5 predicted position and RPY with the Step 6 Webots position and RPY for poses A, B, and C. State whether they agree closely, which pose appears to have the largest difference, and what could explain any important difference. No error formula is required.</w:t>
             </w:r>
           </w:p>
         </w:tc>
@@ -890,7 +890,7 @@
           <w:rFonts w:ascii="Arial" w:hAnsi="Arial"/>
           <w:color w:val="000000"/>
         </w:rPr>
-        <w:t>Screenshots</w:t>
+        <w:t>Webots screenshot</w:t>
       </w:r>
     </w:p>
     <w:tbl>
@@ -941,6 +941,7 @@
               </w:rPr>
               <w:t>SCREENSHOT PLACEHOLDER</w:t>
               <w:br/>
+              <w:t>Insert one Webots screenshot showing the robot and stylus at pose A, B, or C.</w:t>
             </w:r>
             <w:r>
               <w:rPr>
@@ -949,78 +950,6 @@
                 <w:color w:val="000000"/>
                 <w:sz w:val="20"/>
               </w:rPr>
-              <w:t>Insert one Webots screenshot showing the robot/stylus at a measured pose and one screenshot of the comparison summary. Resize as needed.</w:t>
-            </w:r>
-          </w:p>
-        </w:tc>
-      </w:tr>
-    </w:tbl>
-    <w:p>
-      <w:pPr>
-        <w:pStyle w:val="Heading1"/>
-      </w:pPr>
-      <w:r>
-        <w:t>5. What do the results show?</w:t>
-      </w:r>
-    </w:p>
-    <w:p>
-      <w:pPr>
-        <w:spacing w:before="80" w:after="60"/>
-      </w:pPr>
-      <w:r>
-        <w:rPr>
-          <w:rFonts w:ascii="Arial" w:hAnsi="Arial"/>
-          <w:color w:val="000000"/>
-        </w:rPr>
-        <w:t>Short explanation</w:t>
-      </w:r>
-    </w:p>
-    <w:tbl>
-      <w:tblPr>
-        <w:tblW w:type="dxa" w:w="9360"/>
-        <w:tblLayout w:type="fixed"/>
-        <w:tblLook w:firstColumn="1" w:firstRow="1" w:lastColumn="0" w:lastRow="0" w:noHBand="0" w:noVBand="1" w:val="04A0"/>
-        <w:tblInd w:w="120" w:type="dxa"/>
-        <w:tblBorders>
-          <w:top w:val="single" w:sz="4" w:color="D9D9D9"/>
-          <w:left w:val="single" w:sz="4" w:color="D9D9D9"/>
-          <w:bottom w:val="single" w:sz="4" w:color="D9D9D9"/>
-          <w:right w:val="single" w:sz="4" w:color="D9D9D9"/>
-          <w:insideH w:val="single" w:sz="4" w:color="D9D9D9"/>
-          <w:insideV w:val="single" w:sz="4" w:color="D9D9D9"/>
-        </w:tblBorders>
-      </w:tblPr>
-      <w:tblGrid>
-        <w:gridCol w:w="9360"/>
-      </w:tblGrid>
-      <w:tr>
-        <w:trPr>
-          <w:trHeight w:val="1296" w:hRule="atLeast"/>
-        </w:trPr>
-        <w:tc>
-          <w:tcPr>
-            <w:tcW w:type="dxa" w:w="9360"/>
-            <w:tcMar>
-              <w:top w:w="100" w:type="dxa"/>
-              <w:start w:w="120" w:type="dxa"/>
-              <w:bottom w:w="100" w:type="dxa"/>
-              <w:end w:w="120" w:type="dxa"/>
-            </w:tcMar>
-            <w:vAlign w:val="top"/>
-            <w:shd w:fill="FFFFFF"/>
-          </w:tcPr>
-          <w:p>
-            <w:pPr>
-              <w:spacing w:after="0"/>
-            </w:pPr>
-            <w:r>
-              <w:rPr>
-                <w:rFonts w:ascii="Arial" w:hAnsi="Arial"/>
-                <w:i/>
-                <w:color w:val="000000"/>
-                <w:sz w:val="20"/>
-              </w:rPr>
-              <w:t>In 3-5 sentences, state whether the joints reached their targets, whether FK agreed with Webots, which pose had the largest error, and the likely cause of any important discrepancy.</w:t>
             </w:r>
           </w:p>
         </w:tc>

</xml_diff>

<commit_message>
Enhance Lab 2 report template by clarifying qualitative comparison instructions and specifying tool position and orientation details for poses A, B, and C.
</commit_message>
<xml_diff>
--- a/lab02_webots_ur5e_frames/Lab02_Report_Template.docx
+++ b/lab02_webots_ur5e_frames/Lab02_Report_Template.docx
@@ -875,7 +875,19 @@
                 <w:color w:val="000000"/>
                 <w:sz w:val="20"/>
               </w:rPr>
-              <w:t>In 3-5 sentences, compare the Step 5 predicted position and RPY with the Step 6 Webots position and RPY for poses A, B, and C. State whether they agree closely, which pose appears to have the largest difference, and what could explain any important difference. No error formula is required.</w:t>
+              <w:t>For each pose, compare the predicted tool position [x, y, z] and predicted tool RPY [roll, pitch, yaw] from Step 5 with the Webots-measured tool position and tool RPY from Step 6.</w:t>
+              <w:br/>
+              <w:br/>
+              <w:t>Pose A: State whether the predicted and Webots-measured tool position and tool RPY agree closely.</w:t>
+              <w:br/>
+              <w:br/>
+              <w:t>Pose B: State whether the predicted and Webots-measured tool position and tool RPY agree closely.</w:t>
+              <w:br/>
+              <w:br/>
+              <w:t>Pose C: State whether the predicted and Webots-measured tool position and tool RPY agree closely.</w:t>
+              <w:br/>
+              <w:br/>
+              <w:t>RPY means roll, pitch, and yaw: the three angles used here to describe tool orientation about the x-, y-, and z-axes. Write one or two sentences for each pose. No error formula is required.</w:t>
             </w:r>
           </w:p>
         </w:tc>

</xml_diff>

<commit_message>
Update Lab 2 report template by removing unnecessary fields and improving instruction clarity
</commit_message>
<xml_diff>
--- a/lab02_webots_ur5e_frames/Lab02_Report_Template.docx
+++ b/lab02_webots_ur5e_frames/Lab02_Report_Template.docx
@@ -119,7 +119,7 @@
                 <w:color w:val="000000"/>
                 <w:sz w:val="20"/>
               </w:rPr>
-              <w:t>Course section / team</w:t>
+              <w:t>Course section</w:t>
               <w:br/>
             </w:r>
             <w:r>
@@ -138,13 +138,14 @@
       <w:tr>
         <w:tc>
           <w:tcPr>
-            <w:tcW w:type="dxa" w:w="4680"/>
+            <w:tcW w:type="dxa" w:w="9360"/>
             <w:tcMar>
               <w:top w:w="100" w:type="dxa"/>
               <w:start w:w="120" w:type="dxa"/>
               <w:bottom w:w="100" w:type="dxa"/>
               <w:end w:w="120" w:type="dxa"/>
             </w:tcMar>
+            <w:gridSpan w:val="2"/>
             <w:shd w:fill="FFFFFF"/>
             <w:vAlign w:val="center"/>
           </w:tcPr>
@@ -168,32 +169,6 @@
                 <w:sz w:val="20"/>
               </w:rPr>
               <w:t>Click here and type the date</w:t>
-            </w:r>
-          </w:p>
-        </w:tc>
-        <w:tc>
-          <w:tcPr>
-            <w:tcW w:type="dxa" w:w="4680"/>
-            <w:tcMar>
-              <w:top w:w="100" w:type="dxa"/>
-              <w:start w:w="120" w:type="dxa"/>
-              <w:bottom w:w="100" w:type="dxa"/>
-              <w:end w:w="120" w:type="dxa"/>
-            </w:tcMar>
-            <w:shd w:fill="FFFFFF"/>
-            <w:vAlign w:val="center"/>
-          </w:tcPr>
-          <w:p>
-            <w:r>
-              <w:rPr>
-                <w:rFonts w:ascii="Arial" w:hAnsi="Arial"/>
-                <w:b/>
-                <w:color w:val="000000"/>
-                <w:sz w:val="20"/>
-              </w:rPr>
-              <w:t>Lab partner(s)</w:t>
-              <w:br/>
-              <w:t>Type names, or leave blank</w:t>
             </w:r>
           </w:p>
         </w:tc>

</xml_diff>